<commit_message>
Update patent status across documentation and UI components
Changes:
- Revised README.md, llms.txt, and various documents to reflect that ICDU is now patented technology instead of patent-pending.
- Updated SiteFooter, Licensing, and FAQ pages to communicate the patented status.
- Adjusted content in investor materials and examples to clarify the patent status.
- Enhanced CSS for select elements to improve theme compatibility.

These updates ensure consistent communication regarding the patent status of ICDU throughout the application.
</commit_message>
<xml_diff>
--- a/client/public/downloads/ICDU_Executive_Pitch.docx
+++ b/client/public/downloads/ICDU_Executive_Pitch.docx
@@ -1235,7 +1235,7 @@
         <w:sz w:val="13"/>
         <w:szCs w:val="13"/>
       </w:rPr>
-      <w:t xml:space="preserve">Overture Systems  |  bcfrerichs@gmail.com  |  Patent Pending (US Non-Provisional Filed)</w:t>
+      <w:t xml:space="preserve">Overture Systems  |  bcfrerichs@gmail.com  |  Patented (US Non-Provisional Filed)</w:t>
     </w:r>
   </w:p>
 </w:ftr>
@@ -1311,7 +1311,7 @@
         <w:sz w:val="13"/>
         <w:szCs w:val="13"/>
       </w:rPr>
-      <w:t xml:space="preserve">PATENT PENDING</w:t>
+      <w:t xml:space="preserve">PATENTED</w:t>
     </w:r>
   </w:p>
 </w:hdr>

</xml_diff>